<commit_message>
Point to Google Classroom for submission date and place
Co-Authored-By: Claude Opus 5.5 <noreply@anthropic.com>
Claude-Session: https://claude.ai/code/session_01QcwKjrvcPULEZZ9Qz4n5Vo
</commit_message>
<xml_diff>
--- a/ASSIGNMENT_ngrams.docx
+++ b/ASSIGNMENT_ngrams.docx
@@ -680,47 +680,16 @@
           <w:szCs w:val="24"/>
           <w:rtl/>
         </w:rPr>
-        <w:t xml:space="preserve">מועד הגשה:</w:t>
-      </w:r>
-      <w:r>
-        <w:rPr>
-          <w:rFonts w:ascii="Arial" w:cs="Arial" w:eastAsia="Arial" w:hAnsi="Arial"/>
-          <w:sz w:val="24"/>
-          <w:szCs w:val="24"/>
-          <w:rtl/>
-        </w:rPr>
-        <w:t xml:space="preserve"> [להשלים]</w:t>
-      </w:r>
-    </w:p>
-    <w:p>
-      <w:pPr>
-        <w:pStyle w:val="ListParagraph"/>
-        <w:numPr>
-          <w:ilvl w:val="0"/>
-          <w:numId w:val="2"/>
-        </w:numPr>
-        <w:bidi/>
-        <w:spacing w:after="80" w:line="300"/>
-      </w:pPr>
-      <w:r>
-        <w:rPr>
-          <w:rFonts w:ascii="Arial" w:cs="Arial" w:eastAsia="Arial" w:hAnsi="Arial"/>
-          <w:b/>
-          <w:bCs/>
-          <w:sz w:val="24"/>
-          <w:szCs w:val="24"/>
-          <w:rtl/>
-        </w:rPr>
-        <w:t xml:space="preserve">איפה מגישים:</w:t>
-      </w:r>
-      <w:r>
-        <w:rPr>
-          <w:rFonts w:ascii="Arial" w:cs="Arial" w:eastAsia="Arial" w:hAnsi="Arial"/>
-          <w:sz w:val="24"/>
-          <w:szCs w:val="24"/>
-          <w:rtl/>
-        </w:rPr>
-        <w:t xml:space="preserve"> [להשלים]</w:t>
+        <w:t xml:space="preserve">מועד ומקום ההגשה:</w:t>
+      </w:r>
+      <w:r>
+        <w:rPr>
+          <w:rFonts w:ascii="Arial" w:cs="Arial" w:eastAsia="Arial" w:hAnsi="Arial"/>
+          <w:sz w:val="24"/>
+          <w:szCs w:val="24"/>
+          <w:rtl/>
+        </w:rPr>
+        <w:t xml:space="preserve"> מפורסמים ב-Google Classroom</w:t>
       </w:r>
     </w:p>
     <w:p>

</xml_diff>

<commit_message>
Remove sample questions and grading from submission instructions
Co-Authored-By: Claude Opus 5.5 <noreply@anthropic.com>
Claude-Session: https://claude.ai/code/session_01QcwKjrvcPULEZZ9Qz4n5Vo
</commit_message>
<xml_diff>
--- a/ASSIGNMENT_ngrams.docx
+++ b/ASSIGNMENT_ngrams.docx
@@ -2545,372 +2545,6 @@
     </w:p>
     <w:p>
       <w:pPr>
-        <w:bidi/>
-        <w:spacing w:after="120" w:before="0" w:line="300"/>
-      </w:pPr>
-      <w:r>
-        <w:rPr>
-          <w:rFonts w:ascii="Arial" w:cs="Arial" w:eastAsia="Arial" w:hAnsi="Arial"/>
-          <w:sz w:val="24"/>
-          <w:szCs w:val="24"/>
-          <w:rtl/>
-        </w:rPr>
-        <w:t xml:space="preserve">שאלות לדוגמה:</w:t>
-      </w:r>
-    </w:p>
-    <w:p>
-      <w:pPr>
-        <w:pStyle w:val="ListParagraph"/>
-        <w:numPr>
-          <w:ilvl w:val="0"/>
-          <w:numId w:val="2"/>
-        </w:numPr>
-        <w:bidi/>
-        <w:spacing w:after="80" w:line="300"/>
-      </w:pPr>
-      <w:r>
-        <w:rPr>
-          <w:rFonts w:ascii="Arial" w:cs="Arial" w:eastAsia="Arial" w:hAnsi="Arial"/>
-          <w:sz w:val="24"/>
-          <w:szCs w:val="24"/>
-          <w:rtl/>
-        </w:rPr>
-        <w:t xml:space="preserve">למה הלולאה היא </w:t>
-      </w:r>
-      <w:r>
-        <w:rPr>
-          <w:rFonts w:ascii="Consolas" w:cs="Consolas" w:eastAsia="Consolas" w:hAnsi="Consolas"/>
-          <w:color w:val="0F766E"/>
-          <w:sz w:val="22"/>
-          <w:szCs w:val="22"/>
-          <w:rtl w:val="false"/>
-        </w:rPr>
-        <w:t xml:space="preserve">range(len(tokens) - n + 1)‎</w:t>
-      </w:r>
-      <w:r>
-        <w:rPr>
-          <w:rFonts w:ascii="Arial" w:cs="Arial" w:eastAsia="Arial" w:hAnsi="Arial"/>
-          <w:sz w:val="24"/>
-          <w:szCs w:val="24"/>
-          <w:rtl/>
-        </w:rPr>
-        <w:t xml:space="preserve">? מה היה קורה בלי ה-</w:t>
-      </w:r>
-      <w:r>
-        <w:rPr>
-          <w:rFonts w:ascii="Consolas" w:cs="Consolas" w:eastAsia="Consolas" w:hAnsi="Consolas"/>
-          <w:color w:val="0F766E"/>
-          <w:sz w:val="22"/>
-          <w:szCs w:val="22"/>
-          <w:rtl w:val="false"/>
-        </w:rPr>
-        <w:t xml:space="preserve">‎+ 1</w:t>
-      </w:r>
-      <w:r>
-        <w:rPr>
-          <w:rFonts w:ascii="Arial" w:cs="Arial" w:eastAsia="Arial" w:hAnsi="Arial"/>
-          <w:sz w:val="24"/>
-          <w:szCs w:val="24"/>
-          <w:rtl/>
-        </w:rPr>
-        <w:t xml:space="preserve">?</w:t>
-      </w:r>
-    </w:p>
-    <w:p>
-      <w:pPr>
-        <w:pStyle w:val="ListParagraph"/>
-        <w:numPr>
-          <w:ilvl w:val="0"/>
-          <w:numId w:val="2"/>
-        </w:numPr>
-        <w:bidi/>
-        <w:spacing w:after="80" w:line="300"/>
-      </w:pPr>
-      <w:r>
-        <w:rPr>
-          <w:rFonts w:ascii="Arial" w:cs="Arial" w:eastAsia="Arial" w:hAnsi="Arial"/>
-          <w:sz w:val="24"/>
-          <w:szCs w:val="24"/>
-          <w:rtl/>
-        </w:rPr>
-        <w:t xml:space="preserve">מה מחזיר </w:t>
-      </w:r>
-      <w:r>
-        <w:rPr>
-          <w:rFonts w:ascii="Consolas" w:cs="Consolas" w:eastAsia="Consolas" w:hAnsi="Consolas"/>
-          <w:color w:val="0F766E"/>
-          <w:sz w:val="22"/>
-          <w:szCs w:val="22"/>
-          <w:rtl w:val="false"/>
-        </w:rPr>
-        <w:t xml:space="preserve">tokens[i:i + n - 1]‎</w:t>
-      </w:r>
-      <w:r>
-        <w:rPr>
-          <w:rFonts w:ascii="Arial" w:cs="Arial" w:eastAsia="Arial" w:hAnsi="Arial"/>
-          <w:sz w:val="24"/>
-          <w:szCs w:val="24"/>
-          <w:rtl/>
-        </w:rPr>
-        <w:t xml:space="preserve"> כש-n=3? ומה זה </w:t>
-      </w:r>
-      <w:r>
-        <w:rPr>
-          <w:rFonts w:ascii="Consolas" w:cs="Consolas" w:eastAsia="Consolas" w:hAnsi="Consolas"/>
-          <w:color w:val="0F766E"/>
-          <w:sz w:val="22"/>
-          <w:szCs w:val="22"/>
-          <w:rtl w:val="false"/>
-        </w:rPr>
-        <w:t xml:space="preserve">tokens[i + n - 1]‎</w:t>
-      </w:r>
-      <w:r>
-        <w:rPr>
-          <w:rFonts w:ascii="Arial" w:cs="Arial" w:eastAsia="Arial" w:hAnsi="Arial"/>
-          <w:sz w:val="24"/>
-          <w:szCs w:val="24"/>
-          <w:rtl/>
-        </w:rPr>
-        <w:t xml:space="preserve">?</w:t>
-      </w:r>
-    </w:p>
-    <w:p>
-      <w:pPr>
-        <w:pStyle w:val="ListParagraph"/>
-        <w:numPr>
-          <w:ilvl w:val="0"/>
-          <w:numId w:val="2"/>
-        </w:numPr>
-        <w:bidi/>
-        <w:spacing w:after="80" w:line="300"/>
-      </w:pPr>
-      <w:r>
-        <w:rPr>
-          <w:rFonts w:ascii="Arial" w:cs="Arial" w:eastAsia="Arial" w:hAnsi="Arial"/>
-          <w:sz w:val="24"/>
-          <w:szCs w:val="24"/>
-          <w:rtl/>
-        </w:rPr>
-        <w:t xml:space="preserve">למה צריך את ה-</w:t>
-      </w:r>
-      <w:r>
-        <w:rPr>
-          <w:rFonts w:ascii="Consolas" w:cs="Consolas" w:eastAsia="Consolas" w:hAnsi="Consolas"/>
-          <w:color w:val="0F766E"/>
-          <w:sz w:val="22"/>
-          <w:szCs w:val="22"/>
-          <w:rtl w:val="false"/>
-        </w:rPr>
-        <w:t xml:space="preserve">if</w:t>
-      </w:r>
-      <w:r>
-        <w:rPr>
-          <w:rFonts w:ascii="Arial" w:cs="Arial" w:eastAsia="Arial" w:hAnsi="Arial"/>
-          <w:sz w:val="24"/>
-          <w:szCs w:val="24"/>
-          <w:rtl/>
-        </w:rPr>
-        <w:t xml:space="preserve"> לפני ה-</w:t>
-      </w:r>
-      <w:r>
-        <w:rPr>
-          <w:rFonts w:ascii="Consolas" w:cs="Consolas" w:eastAsia="Consolas" w:hAnsi="Consolas"/>
-          <w:color w:val="0F766E"/>
-          <w:sz w:val="22"/>
-          <w:szCs w:val="22"/>
-          <w:rtl w:val="false"/>
-        </w:rPr>
-        <w:t xml:space="preserve">append</w:t>
-      </w:r>
-      <w:r>
-        <w:rPr>
-          <w:rFonts w:ascii="Arial" w:cs="Arial" w:eastAsia="Arial" w:hAnsi="Arial"/>
-          <w:sz w:val="24"/>
-          <w:szCs w:val="24"/>
-          <w:rtl/>
-        </w:rPr>
-        <w:t xml:space="preserve">? מה יקרה בלעדיו?</w:t>
-      </w:r>
-    </w:p>
-    <w:p>
-      <w:pPr>
-        <w:pStyle w:val="ListParagraph"/>
-        <w:numPr>
-          <w:ilvl w:val="0"/>
-          <w:numId w:val="2"/>
-        </w:numPr>
-        <w:bidi/>
-        <w:spacing w:after="80" w:line="300"/>
-      </w:pPr>
-      <w:r>
-        <w:rPr>
-          <w:rFonts w:ascii="Arial" w:cs="Arial" w:eastAsia="Arial" w:hAnsi="Arial"/>
-          <w:sz w:val="24"/>
-          <w:szCs w:val="24"/>
-          <w:rtl/>
-        </w:rPr>
-        <w:t xml:space="preserve">מה ההבדל בין </w:t>
-      </w:r>
-      <w:r>
-        <w:rPr>
-          <w:rFonts w:ascii="Consolas" w:cs="Consolas" w:eastAsia="Consolas" w:hAnsi="Consolas"/>
-          <w:color w:val="0F766E"/>
-          <w:sz w:val="22"/>
-          <w:szCs w:val="22"/>
-          <w:rtl w:val="false"/>
-        </w:rPr>
-        <w:t xml:space="preserve">d[key]‎</w:t>
-      </w:r>
-      <w:r>
-        <w:rPr>
-          <w:rFonts w:ascii="Arial" w:cs="Arial" w:eastAsia="Arial" w:hAnsi="Arial"/>
-          <w:sz w:val="24"/>
-          <w:szCs w:val="24"/>
-          <w:rtl/>
-        </w:rPr>
-        <w:t xml:space="preserve"> לבין </w:t>
-      </w:r>
-      <w:r>
-        <w:rPr>
-          <w:rFonts w:ascii="Consolas" w:cs="Consolas" w:eastAsia="Consolas" w:hAnsi="Consolas"/>
-          <w:color w:val="0F766E"/>
-          <w:sz w:val="22"/>
-          <w:szCs w:val="22"/>
-          <w:rtl w:val="false"/>
-        </w:rPr>
-        <w:t xml:space="preserve">d.get(key, [])‎</w:t>
-      </w:r>
-      <w:r>
-        <w:rPr>
-          <w:rFonts w:ascii="Arial" w:cs="Arial" w:eastAsia="Arial" w:hAnsi="Arial"/>
-          <w:sz w:val="24"/>
-          <w:szCs w:val="24"/>
-          <w:rtl/>
-        </w:rPr>
-        <w:t xml:space="preserve">?</w:t>
-      </w:r>
-    </w:p>
-    <w:p>
-      <w:pPr>
-        <w:pStyle w:val="ListParagraph"/>
-        <w:numPr>
-          <w:ilvl w:val="0"/>
-          <w:numId w:val="2"/>
-        </w:numPr>
-        <w:bidi/>
-        <w:spacing w:after="80" w:line="300"/>
-      </w:pPr>
-      <w:r>
-        <w:rPr>
-          <w:rFonts w:ascii="Arial" w:cs="Arial" w:eastAsia="Arial" w:hAnsi="Arial"/>
-          <w:sz w:val="24"/>
-          <w:szCs w:val="24"/>
-          <w:rtl/>
-        </w:rPr>
-        <w:t xml:space="preserve">למה שומרים חזרות ברשימה ולא סופרים כמה פעמים כל מילה הופיעה?</w:t>
-      </w:r>
-    </w:p>
-    <w:p>
-      <w:pPr>
-        <w:pStyle w:val="ListParagraph"/>
-        <w:numPr>
-          <w:ilvl w:val="0"/>
-          <w:numId w:val="2"/>
-        </w:numPr>
-        <w:bidi/>
-        <w:spacing w:after="80" w:line="300"/>
-      </w:pPr>
-      <w:r>
-        <w:rPr>
-          <w:rFonts w:ascii="Arial" w:cs="Arial" w:eastAsia="Arial" w:hAnsi="Arial"/>
-          <w:sz w:val="24"/>
-          <w:szCs w:val="24"/>
-          <w:rtl/>
-        </w:rPr>
-        <w:t xml:space="preserve">למה המפתח הוא מחרוזת ולא רשימה?</w:t>
-      </w:r>
-    </w:p>
-    <w:p>
-      <w:pPr>
-        <w:pStyle w:val="ListParagraph"/>
-        <w:numPr>
-          <w:ilvl w:val="0"/>
-          <w:numId w:val="2"/>
-        </w:numPr>
-        <w:bidi/>
-        <w:spacing w:after="80" w:line="300"/>
-      </w:pPr>
-      <w:r>
-        <w:rPr>
-          <w:rFonts w:ascii="Arial" w:cs="Arial" w:eastAsia="Arial" w:hAnsi="Arial"/>
-          <w:sz w:val="24"/>
-          <w:szCs w:val="24"/>
-          <w:rtl/>
-        </w:rPr>
-        <w:t xml:space="preserve">מה יש במילון אחרי </w:t>
-      </w:r>
-      <w:r>
-        <w:rPr>
-          <w:rFonts w:ascii="Consolas" w:cs="Consolas" w:eastAsia="Consolas" w:hAnsi="Consolas"/>
-          <w:color w:val="0F766E"/>
-          <w:sz w:val="22"/>
-          <w:szCs w:val="22"/>
-          <w:rtl w:val="false"/>
-        </w:rPr>
-        <w:t xml:space="preserve">‎&lt;EOS&gt;‎</w:t>
-      </w:r>
-      <w:r>
-        <w:rPr>
-          <w:rFonts w:ascii="Arial" w:cs="Arial" w:eastAsia="Arial" w:hAnsi="Arial"/>
-          <w:sz w:val="24"/>
-          <w:szCs w:val="24"/>
-          <w:rtl/>
-        </w:rPr>
-        <w:t xml:space="preserve">, ולמה זה שימושי?</w:t>
-      </w:r>
-    </w:p>
-    <w:p>
-      <w:pPr>
-        <w:pStyle w:val="ListParagraph"/>
-        <w:numPr>
-          <w:ilvl w:val="0"/>
-          <w:numId w:val="2"/>
-        </w:numPr>
-        <w:bidi/>
-        <w:spacing w:after="80" w:line="300"/>
-      </w:pPr>
-      <w:r>
-        <w:rPr>
-          <w:rFonts w:ascii="Arial" w:cs="Arial" w:eastAsia="Arial" w:hAnsi="Arial"/>
-          <w:sz w:val="24"/>
-          <w:szCs w:val="24"/>
-          <w:rtl/>
-        </w:rPr>
-        <w:t xml:space="preserve">למה המילה האחרונה בטקסט לא נכנסת כמפתח?</w:t>
-      </w:r>
-    </w:p>
-    <w:p>
-      <w:pPr>
-        <w:pStyle w:val="ListParagraph"/>
-        <w:numPr>
-          <w:ilvl w:val="0"/>
-          <w:numId w:val="2"/>
-        </w:numPr>
-        <w:bidi/>
-        <w:spacing w:after="80" w:line="300"/>
-      </w:pPr>
-      <w:r>
-        <w:rPr>
-          <w:rFonts w:ascii="Arial" w:cs="Arial" w:eastAsia="Arial" w:hAnsi="Arial"/>
-          <w:sz w:val="24"/>
-          <w:szCs w:val="24"/>
-          <w:rtl/>
-        </w:rPr>
-        <w:t xml:space="preserve">מה ההבדל בין מילון ה-2-Gram למילון ה-5-Gram של אותו טקסט?</w:t>
-      </w:r>
-    </w:p>
-    <w:p>
-      <w:pPr>
         <w:shd w:fill="FEF3C7" w:color="auto" w:val="clear"/>
         <w:bidi/>
         <w:spacing w:after="160" w:before="120" w:line="300"/>
@@ -3254,383 +2888,6 @@
           <w:rtl/>
         </w:rPr>
         <w:t xml:space="preserve"> והריצו על הטוקנים שלכם. התוצאה צריכה להיות זהה.</w:t>
-      </w:r>
-    </w:p>
-    <w:p>
-      <w:pPr>
-        <w:pStyle w:val="Heading1"/>
-        <w:keepNext/>
-        <w:pBdr>
-          <w:bottom w:val="single" w:color="D9DED8" w:sz="6" w:space="4"/>
-        </w:pBdr>
-        <w:bidi/>
-        <w:spacing w:after="120" w:before="320"/>
-      </w:pPr>
-      <w:r>
-        <w:rPr>
-          <w:rFonts w:ascii="Arial" w:cs="Arial" w:eastAsia="Arial" w:hAnsi="Arial"/>
-          <w:b/>
-          <w:bCs/>
-          <w:color w:val="0F766E"/>
-          <w:sz w:val="30"/>
-          <w:szCs w:val="30"/>
-          <w:rtl/>
-        </w:rPr>
-        <w:t xml:space="preserve">איך העבודה נבדקת</w:t>
-      </w:r>
-    </w:p>
-    <w:tbl>
-      <w:tblPr>
-        <w:bidiVisual/>
-        <w:tblW w:type="dxa" w:w="9300"/>
-        <w:tblBorders>
-          <w:top w:val="single" w:color="auto" w:sz="4"/>
-          <w:left w:val="single" w:color="auto" w:sz="4"/>
-          <w:bottom w:val="single" w:color="auto" w:sz="4"/>
-          <w:right w:val="single" w:color="auto" w:sz="4"/>
-          <w:insideH w:val="single" w:color="auto" w:sz="4"/>
-          <w:insideV w:val="single" w:color="auto" w:sz="4"/>
-        </w:tblBorders>
-      </w:tblPr>
-      <w:tblGrid>
-        <w:gridCol w:w="8300"/>
-        <w:gridCol w:w="1000"/>
-      </w:tblGrid>
-      <w:tr>
-        <w:trPr>
-          <w:cantSplit/>
-          <w:tblHeader/>
-        </w:trPr>
-        <w:tc>
-          <w:tcPr>
-            <w:tcW w:type="dxa" w:w="8300"/>
-            <w:tcBorders>
-              <w:top w:val="single" w:color="C9CFC8" w:sz="4"/>
-              <w:left w:val="single" w:color="C9CFC8" w:sz="4"/>
-              <w:bottom w:val="single" w:color="C9CFC8" w:sz="4"/>
-              <w:right w:val="single" w:color="C9CFC8" w:sz="4"/>
-            </w:tcBorders>
-            <w:shd w:fill="0F172A" w:color="auto" w:val="clear"/>
-            <w:tcMar>
-              <w:top w:type="dxa" w:w="80"/>
-              <w:left w:type="dxa" w:w="120"/>
-              <w:bottom w:type="dxa" w:w="80"/>
-              <w:right w:type="dxa" w:w="120"/>
-            </w:tcMar>
-          </w:tcPr>
-          <w:p>
-            <w:pPr>
-              <w:bidi/>
-            </w:pPr>
-            <w:r>
-              <w:rPr>
-                <w:rFonts w:ascii="Arial" w:cs="Arial" w:eastAsia="Arial" w:hAnsi="Arial"/>
-                <w:b/>
-                <w:bCs/>
-                <w:color w:val="FFFFFF"/>
-                <w:sz w:val="22"/>
-                <w:szCs w:val="22"/>
-                <w:rtl/>
-              </w:rPr>
-              <w:t xml:space="preserve">רכיב</w:t>
-            </w:r>
-          </w:p>
-        </w:tc>
-        <w:tc>
-          <w:tcPr>
-            <w:tcW w:type="dxa" w:w="1000"/>
-            <w:tcBorders>
-              <w:top w:val="single" w:color="C9CFC8" w:sz="4"/>
-              <w:left w:val="single" w:color="C9CFC8" w:sz="4"/>
-              <w:bottom w:val="single" w:color="C9CFC8" w:sz="4"/>
-              <w:right w:val="single" w:color="C9CFC8" w:sz="4"/>
-            </w:tcBorders>
-            <w:shd w:fill="0F172A" w:color="auto" w:val="clear"/>
-            <w:tcMar>
-              <w:top w:type="dxa" w:w="80"/>
-              <w:left w:type="dxa" w:w="120"/>
-              <w:bottom w:type="dxa" w:w="80"/>
-              <w:right w:type="dxa" w:w="120"/>
-            </w:tcMar>
-          </w:tcPr>
-          <w:p>
-            <w:pPr>
-              <w:bidi/>
-            </w:pPr>
-            <w:r>
-              <w:rPr>
-                <w:rFonts w:ascii="Arial" w:cs="Arial" w:eastAsia="Arial" w:hAnsi="Arial"/>
-                <w:b/>
-                <w:bCs/>
-                <w:color w:val="FFFFFF"/>
-                <w:sz w:val="22"/>
-                <w:szCs w:val="22"/>
-                <w:rtl/>
-              </w:rPr>
-              <w:t xml:space="preserve">נקודות</w:t>
-            </w:r>
-          </w:p>
-        </w:tc>
-      </w:tr>
-      <w:tr>
-        <w:trPr>
-          <w:cantSplit/>
-        </w:trPr>
-        <w:tc>
-          <w:tcPr>
-            <w:tcW w:type="dxa" w:w="8300"/>
-            <w:tcBorders>
-              <w:top w:val="single" w:color="C9CFC8" w:sz="4"/>
-              <w:left w:val="single" w:color="C9CFC8" w:sz="4"/>
-              <w:bottom w:val="single" w:color="C9CFC8" w:sz="4"/>
-              <w:right w:val="single" w:color="C9CFC8" w:sz="4"/>
-            </w:tcBorders>
-            <w:tcMar>
-              <w:top w:type="dxa" w:w="80"/>
-              <w:left w:type="dxa" w:w="120"/>
-              <w:bottom w:type="dxa" w:w="80"/>
-              <w:right w:type="dxa" w:w="120"/>
-            </w:tcMar>
-          </w:tcPr>
-          <w:p>
-            <w:pPr>
-              <w:bidi/>
-            </w:pPr>
-            <w:r>
-              <w:rPr>
-                <w:rFonts w:ascii="Arial" w:cs="Arial" w:eastAsia="Arial" w:hAnsi="Arial"/>
-                <w:sz w:val="22"/>
-                <w:szCs w:val="22"/>
-                <w:rtl/>
-              </w:rPr>
-              <w:t xml:space="preserve">קובץ הבדיקה: חלק יחסי לפי מספר הבדיקות שעוברות מתוך 12</w:t>
-            </w:r>
-          </w:p>
-        </w:tc>
-        <w:tc>
-          <w:tcPr>
-            <w:tcW w:type="dxa" w:w="1000"/>
-            <w:tcBorders>
-              <w:top w:val="single" w:color="C9CFC8" w:sz="4"/>
-              <w:left w:val="single" w:color="C9CFC8" w:sz="4"/>
-              <w:bottom w:val="single" w:color="C9CFC8" w:sz="4"/>
-              <w:right w:val="single" w:color="C9CFC8" w:sz="4"/>
-            </w:tcBorders>
-            <w:tcMar>
-              <w:top w:type="dxa" w:w="80"/>
-              <w:left w:type="dxa" w:w="120"/>
-              <w:bottom w:type="dxa" w:w="80"/>
-              <w:right w:type="dxa" w:w="120"/>
-            </w:tcMar>
-          </w:tcPr>
-          <w:p>
-            <w:pPr>
-              <w:bidi/>
-            </w:pPr>
-            <w:r>
-              <w:rPr>
-                <w:rFonts w:ascii="Arial" w:cs="Arial" w:eastAsia="Arial" w:hAnsi="Arial"/>
-                <w:sz w:val="22"/>
-                <w:szCs w:val="22"/>
-                <w:rtl/>
-              </w:rPr>
-              <w:t xml:space="preserve">50</w:t>
-            </w:r>
-          </w:p>
-        </w:tc>
-      </w:tr>
-      <w:tr>
-        <w:trPr>
-          <w:cantSplit/>
-        </w:trPr>
-        <w:tc>
-          <w:tcPr>
-            <w:tcW w:type="dxa" w:w="8300"/>
-            <w:tcBorders>
-              <w:top w:val="single" w:color="C9CFC8" w:sz="4"/>
-              <w:left w:val="single" w:color="C9CFC8" w:sz="4"/>
-              <w:bottom w:val="single" w:color="C9CFC8" w:sz="4"/>
-              <w:right w:val="single" w:color="C9CFC8" w:sz="4"/>
-            </w:tcBorders>
-            <w:tcMar>
-              <w:top w:type="dxa" w:w="80"/>
-              <w:left w:type="dxa" w:w="120"/>
-              <w:bottom w:type="dxa" w:w="80"/>
-              <w:right w:type="dxa" w:w="120"/>
-            </w:tcMar>
-          </w:tcPr>
-          <w:p>
-            <w:pPr>
-              <w:bidi/>
-            </w:pPr>
-            <w:r>
-              <w:rPr>
-                <w:rFonts w:ascii="Arial" w:cs="Arial" w:eastAsia="Arial" w:hAnsi="Arial"/>
-                <w:sz w:val="22"/>
-                <w:szCs w:val="22"/>
-                <w:rtl/>
-              </w:rPr>
-              <w:t xml:space="preserve">שיחת ההסבר: הסבר נכון של השורות שהמורה בוחר</w:t>
-            </w:r>
-          </w:p>
-        </w:tc>
-        <w:tc>
-          <w:tcPr>
-            <w:tcW w:type="dxa" w:w="1000"/>
-            <w:tcBorders>
-              <w:top w:val="single" w:color="C9CFC8" w:sz="4"/>
-              <w:left w:val="single" w:color="C9CFC8" w:sz="4"/>
-              <w:bottom w:val="single" w:color="C9CFC8" w:sz="4"/>
-              <w:right w:val="single" w:color="C9CFC8" w:sz="4"/>
-            </w:tcBorders>
-            <w:tcMar>
-              <w:top w:type="dxa" w:w="80"/>
-              <w:left w:type="dxa" w:w="120"/>
-              <w:bottom w:type="dxa" w:w="80"/>
-              <w:right w:type="dxa" w:w="120"/>
-            </w:tcMar>
-          </w:tcPr>
-          <w:p>
-            <w:pPr>
-              <w:bidi/>
-            </w:pPr>
-            <w:r>
-              <w:rPr>
-                <w:rFonts w:ascii="Arial" w:cs="Arial" w:eastAsia="Arial" w:hAnsi="Arial"/>
-                <w:sz w:val="22"/>
-                <w:szCs w:val="22"/>
-                <w:rtl/>
-              </w:rPr>
-              <w:t xml:space="preserve">40</w:t>
-            </w:r>
-          </w:p>
-        </w:tc>
-      </w:tr>
-      <w:tr>
-        <w:trPr>
-          <w:cantSplit/>
-        </w:trPr>
-        <w:tc>
-          <w:tcPr>
-            <w:tcW w:type="dxa" w:w="8300"/>
-            <w:tcBorders>
-              <w:top w:val="single" w:color="C9CFC8" w:sz="4"/>
-              <w:left w:val="single" w:color="C9CFC8" w:sz="4"/>
-              <w:bottom w:val="single" w:color="C9CFC8" w:sz="4"/>
-              <w:right w:val="single" w:color="C9CFC8" w:sz="4"/>
-            </w:tcBorders>
-            <w:tcMar>
-              <w:top w:type="dxa" w:w="80"/>
-              <w:left w:type="dxa" w:w="120"/>
-              <w:bottom w:type="dxa" w:w="80"/>
-              <w:right w:type="dxa" w:w="120"/>
-            </w:tcMar>
-          </w:tcPr>
-          <w:p>
-            <w:pPr>
-              <w:bidi/>
-            </w:pPr>
-            <w:r>
-              <w:rPr>
-                <w:rFonts w:ascii="Arial" w:cs="Arial" w:eastAsia="Arial" w:hAnsi="Arial"/>
-                <w:sz w:val="22"/>
-                <w:szCs w:val="22"/>
-                <w:rtl/>
-              </w:rPr>
-              <w:t xml:space="preserve">קריאות: </w:t>
-            </w:r>
-            <w:r>
-              <w:rPr>
-                <w:rFonts w:ascii="Consolas" w:cs="Consolas" w:eastAsia="Consolas" w:hAnsi="Consolas"/>
-                <w:color w:val="0F766E"/>
-                <w:sz w:val="20"/>
-                <w:szCs w:val="20"/>
-                <w:rtl w:val="false"/>
-              </w:rPr>
-              <w:t xml:space="preserve">make_key</w:t>
-            </w:r>
-            <w:r>
-              <w:rPr>
-                <w:rFonts w:ascii="Arial" w:cs="Arial" w:eastAsia="Arial" w:hAnsi="Arial"/>
-                <w:sz w:val="22"/>
-                <w:szCs w:val="22"/>
-                <w:rtl/>
-              </w:rPr>
-              <w:t xml:space="preserve"> ו-</w:t>
-            </w:r>
-            <w:r>
-              <w:rPr>
-                <w:rFonts w:ascii="Consolas" w:cs="Consolas" w:eastAsia="Consolas" w:hAnsi="Consolas"/>
-                <w:color w:val="0F766E"/>
-                <w:sz w:val="20"/>
-                <w:szCs w:val="20"/>
-                <w:rtl w:val="false"/>
-              </w:rPr>
-              <w:t xml:space="preserve">build_ngrams</w:t>
-            </w:r>
-            <w:r>
-              <w:rPr>
-                <w:rFonts w:ascii="Arial" w:cs="Arial" w:eastAsia="Arial" w:hAnsi="Arial"/>
-                <w:sz w:val="22"/>
-                <w:szCs w:val="22"/>
-                <w:rtl/>
-              </w:rPr>
-              <w:t xml:space="preserve"> בשימוש חוזר, בלי קוד מת ובלי שורות זמניות</w:t>
-            </w:r>
-          </w:p>
-        </w:tc>
-        <w:tc>
-          <w:tcPr>
-            <w:tcW w:type="dxa" w:w="1000"/>
-            <w:tcBorders>
-              <w:top w:val="single" w:color="C9CFC8" w:sz="4"/>
-              <w:left w:val="single" w:color="C9CFC8" w:sz="4"/>
-              <w:bottom w:val="single" w:color="C9CFC8" w:sz="4"/>
-              <w:right w:val="single" w:color="C9CFC8" w:sz="4"/>
-            </w:tcBorders>
-            <w:tcMar>
-              <w:top w:type="dxa" w:w="80"/>
-              <w:left w:type="dxa" w:w="120"/>
-              <w:bottom w:type="dxa" w:w="80"/>
-              <w:right w:type="dxa" w:w="120"/>
-            </w:tcMar>
-          </w:tcPr>
-          <w:p>
-            <w:pPr>
-              <w:bidi/>
-            </w:pPr>
-            <w:r>
-              <w:rPr>
-                <w:rFonts w:ascii="Arial" w:cs="Arial" w:eastAsia="Arial" w:hAnsi="Arial"/>
-                <w:sz w:val="22"/>
-                <w:szCs w:val="22"/>
-                <w:rtl/>
-              </w:rPr>
-              <w:t xml:space="preserve">10</w:t>
-            </w:r>
-          </w:p>
-        </w:tc>
-      </w:tr>
-    </w:tbl>
-    <w:p>
-      <w:pPr>
-        <w:bidi/>
-        <w:spacing w:after="60"/>
-      </w:pPr>
-    </w:p>
-    <w:p>
-      <w:pPr>
-        <w:bidi/>
-        <w:spacing w:after="120" w:before="0" w:line="300"/>
-      </w:pPr>
-      <w:r>
-        <w:rPr>
-          <w:rFonts w:ascii="Arial" w:cs="Arial" w:eastAsia="Arial" w:hAnsi="Arial"/>
-          <w:sz w:val="24"/>
-          <w:szCs w:val="24"/>
-          <w:rtl/>
-        </w:rPr>
-        <w:t xml:space="preserve">קוד שעובר את כל הבדיקות אבל לא מוסבר בשיחה לא יקבל ציון מלא.</w:t>
       </w:r>
     </w:p>
     <w:sectPr>

</xml_diff>